<commit_message>
Improve project report formatting
</commit_message>
<xml_diff>
--- a/Thanusree_ProjectReport.docx
+++ b/Thanusree_ProjectReport.docx
@@ -177,11 +177,6 @@
           <w:i w:val="0"/>
         </w:rPr>
         <w:t>The project combines data preparation, exploratory analysis, business insights, predictive analytics, machine learning, and interactive dashboard concepts into a single student-success intelligence solution.</w:t>
-      </w:r>
-    </w:p>
-    <w:p>
-      <w:r>
-        <w:br w:type="page"/>
       </w:r>
     </w:p>
     <w:p>

</xml_diff>